<commit_message>
docs(kt-002): viết lại phân quyền thành mô hình chung, lưu VC-TK-004 tham khảo
- Viết lại VC-KT-002 thành mô hình phân quyền chung cho toàn nền tảng VI
  CONNECT (bỏ khung "Giai đoạn 1"): tách kiến trúc tổng quát (Mục 3-9, có tầng
  Membership/Tenant dự phòng mở rộng) khỏi ma trận permission đang bật (Mục
  7, 13); bổ sung scope PARTY cho domain EXECUTE (một Project bắc cầu 2 tổ
  chức); đổi tên role VAST_ADMIN→SUPERADMIN, HOI_ADMIN→ADMIN trong tài liệu
  (chưa áp dụng vào mã nguồn — xem Phụ lục B mục B11).
- Lưu VC-TK-004 (kiến trúc multi-tenant đích do một phiên Codex khác đề xuất,
  tự nhận mã VC-KT-002/APPROVED không hợp lệ) ở trạng thái REFERENCE, không
  thay thế VC-KT-002 hiện hành, kèm ghi chú các điểm mâu thuẫn với
  AGENTS.md/docs/SCOPE.md.
- Cập nhật danh mục tài liệu VC-QT-003 và CHANGELOG.md tương ứng.
- Cập nhật bản thảo thuyết minh đề án v0.6.

Co-Authored-By: Claude Sonnet 5 <noreply@anthropic.com>
</commit_message>
<xml_diff>
--- a/01_CHIEN-LUOC-DE-AN/02_DANG-SOAN-THAO/VC-DA-001-ThuyetMinhDeAn-DRAFT_v0.6_20260817.docx
+++ b/01_CHIEN-LUOC-DE-AN/02_DANG-SOAN-THAO/VC-DA-001-ThuyetMinhDeAn-DRAFT_v0.6_20260817.docx
@@ -524,6 +524,73 @@
                 <w:lang w:val="vi-VN"/>
               </w:rPr>
             </w:pPr>
+            <w:r>
+              <w:rPr>
+                <w:b/>
+                <w:bCs/>
+                <w:i/>
+                <w:iCs/>
+                <w:color w:val="000000" w:themeColor="text1"/>
+                <w:sz w:val="26"/>
+                <w:szCs w:val="26"/>
+                <w:lang w:val="vi-VN"/>
+              </w:rPr>
+              <w:drawing>
+                <wp:anchor distT="0" distB="0" distL="114300" distR="114300" simplePos="0" relativeHeight="251658240" behindDoc="0" locked="0" layoutInCell="1" allowOverlap="1" wp14:anchorId="346B3C03" wp14:editId="4078A4F4">
+                  <wp:simplePos x="0" y="0"/>
+                  <wp:positionH relativeFrom="column">
+                    <wp:posOffset>-571305</wp:posOffset>
+                  </wp:positionH>
+                  <wp:positionV relativeFrom="paragraph">
+                    <wp:posOffset>-576466</wp:posOffset>
+                  </wp:positionV>
+                  <wp:extent cx="1575581" cy="1773605"/>
+                  <wp:effectExtent l="0" t="0" r="0" b="4445"/>
+                  <wp:wrapNone/>
+                  <wp:docPr id="961458266" name="Picture 1"/>
+                  <wp:cNvGraphicFramePr>
+                    <a:graphicFrameLocks xmlns:a="http://schemas.openxmlformats.org/drawingml/2006/main" noChangeAspect="1"/>
+                  </wp:cNvGraphicFramePr>
+                  <a:graphic xmlns:a="http://schemas.openxmlformats.org/drawingml/2006/main">
+                    <a:graphicData uri="http://schemas.openxmlformats.org/drawingml/2006/picture">
+                      <pic:pic xmlns:pic="http://schemas.openxmlformats.org/drawingml/2006/picture">
+                        <pic:nvPicPr>
+                          <pic:cNvPr id="961458266" name=""/>
+                          <pic:cNvPicPr/>
+                        </pic:nvPicPr>
+                        <pic:blipFill>
+                          <a:blip r:embed="rId9">
+                            <a:extLst>
+                              <a:ext uri="{28A0092B-C50C-407E-A947-70E740481C1C}">
+                                <a14:useLocalDpi xmlns:a14="http://schemas.microsoft.com/office/drawing/2010/main" val="0"/>
+                              </a:ext>
+                            </a:extLst>
+                          </a:blip>
+                          <a:stretch>
+                            <a:fillRect/>
+                          </a:stretch>
+                        </pic:blipFill>
+                        <pic:spPr>
+                          <a:xfrm>
+                            <a:off x="0" y="0"/>
+                            <a:ext cx="1575581" cy="1773605"/>
+                          </a:xfrm>
+                          <a:prstGeom prst="rect">
+                            <a:avLst/>
+                          </a:prstGeom>
+                        </pic:spPr>
+                      </pic:pic>
+                    </a:graphicData>
+                  </a:graphic>
+                  <wp14:sizeRelH relativeFrom="page">
+                    <wp14:pctWidth>0</wp14:pctWidth>
+                  </wp14:sizeRelH>
+                  <wp14:sizeRelV relativeFrom="page">
+                    <wp14:pctHeight>0</wp14:pctHeight>
+                  </wp14:sizeRelV>
+                </wp:anchor>
+              </w:drawing>
+            </w:r>
           </w:p>
         </w:tc>
         <w:tc>
@@ -7880,7 +7947,7 @@
                     </pic:cNvPicPr>
                   </pic:nvPicPr>
                   <pic:blipFill rotWithShape="1">
-                    <a:blip r:embed="rId9"/>
+                    <a:blip r:embed="rId10"/>
                     <a:srcRect t="7238" b="3016"/>
                     <a:stretch>
                       <a:fillRect/>
@@ -9228,7 +9295,6 @@
                 <w:sz w:val="26"/>
                 <w:szCs w:val="26"/>
               </w:rPr>
-              <w:lastRenderedPageBreak/>
               <w:t>Quan hệ dự kiến với VI CONNECT</w:t>
             </w:r>
           </w:p>
@@ -10616,7 +10682,7 @@
                     <pic:cNvPicPr/>
                   </pic:nvPicPr>
                   <pic:blipFill>
-                    <a:blip r:embed="rId10"/>
+                    <a:blip r:embed="rId11"/>
                     <a:stretch>
                       <a:fillRect/>
                     </a:stretch>
@@ -20233,7 +20299,7 @@
       </w:r>
     </w:p>
     <w:sectPr>
-      <w:headerReference w:type="default" r:id="rId11"/>
+      <w:headerReference w:type="default" r:id="rId12"/>
       <w:pgSz w:w="11906" w:h="16838"/>
       <w:pgMar w:top="1134" w:right="1134" w:bottom="1134" w:left="1701" w:header="567" w:footer="567" w:gutter="0"/>
       <w:cols w:space="720"/>

</xml_diff>